<commit_message>
Replace Financier ledger with generic Deed cards
</commit_message>
<xml_diff>
--- a/releases/v0.6/faction-guides/financier/Gauntlet_v0.6_Financier_Faction_Guide.docx
+++ b/releases/v0.6/faction-guides/financier/Gauntlet_v0.6_Financier_Faction_Guide.docx
@@ -1066,25 +1066,7 @@
         <w:pStyle w:val="ListNumber"/>
       </w:pPr>
       <w:r>
-        <w:rPr>
-          <w:b w:val="0"/>
-          <w:i w:val="0"/>
-        </w:rPr>
-        <w:t xml:space="preserve">one </w:t>
-      </w:r>
-      <w:r>
-        <w:rPr>
-          <w:b/>
-          <w:i w:val="0"/>
-        </w:rPr>
-        <w:t>Financier Ledger</w:t>
-      </w:r>
-      <w:r>
-        <w:rPr>
-          <w:b w:val="0"/>
-          <w:i w:val="0"/>
-        </w:rPr>
-        <w:t xml:space="preserve"> or equivalent number record for current Capital and Deed ownership;</w:t>
+        <w:t>one public Capital Tracker or equivalent number tracker;</w:t>
       </w:r>
     </w:p>
     <w:p>
@@ -1092,44 +1074,36 @@
         <w:pStyle w:val="ListNumber"/>
       </w:pPr>
       <w:r>
-        <w:rPr>
-          <w:b w:val="0"/>
-          <w:i w:val="0"/>
-        </w:rPr>
-        <w:t>any Financier playable cards included through normal deck construction.</w:t>
+        <w:t>eight identical full-size Deed Cards, kept in a shared supply;</w:t>
       </w:r>
     </w:p>
     <w:p>
+      <w:pPr>
+        <w:pStyle w:val="ListNumber"/>
+      </w:pPr>
       <w:r>
         <w:rPr>
           <w:b w:val="0"/>
           <w:i w:val="0"/>
         </w:rPr>
-        <w:t>Capital and Deed ownership are tracked values, not currency tokens. Treasury cards remain face up near the Financier play area. The physical reference implementation may use a writable ledger, sliding number reference, or digital tracker, but it must show current Capital and Deed ownership publicly.</w:t>
+        <w:t>any Financier playable cards included through normal deck construction.</w:t>
       </w:r>
     </w:p>
     <w:p>
-      <w:pPr>
-        <w:pStyle w:val="Heading2"/>
-      </w:pPr>
-      <w:r>
-        <w:rPr>
-          <w:b w:val="0"/>
-          <w:i w:val="0"/>
-        </w:rPr>
-        <w:t>Setup</w:t>
+      <w:r>
+        <w:t>Capital remains a public tracked value. Deed ownership is represented physically rather than written on a ledger. Treasury cards remain face up near the Financier play area. The eight generic Deed Cards are shared supplemental cards with no deckbuilding value. Eight cards cover the maximum number of Territories that can be present in the Gauntlet.</w:t>
       </w:r>
     </w:p>
     <w:p>
       <w:pPr>
-        <w:pStyle w:val="ListBullet"/>
+        <w:pStyle w:val="Heading2"/>
       </w:pPr>
       <w:r>
         <w:rPr>
           <w:b w:val="0"/>
           <w:i w:val="0"/>
         </w:rPr>
-        <w:t>Choose Banker or Executive during deck construction.</w:t>
+        <w:t>Setup</w:t>
       </w:r>
     </w:p>
     <w:p>
@@ -1141,7 +1115,7 @@
           <w:b w:val="0"/>
           <w:i w:val="0"/>
         </w:rPr>
-        <w:t>Place the selected Leader Card and Financier Reference near your play area.</w:t>
+        <w:t>Choose Banker or Executive during deck construction.</w:t>
       </w:r>
     </w:p>
     <w:p>
@@ -1149,11 +1123,7 @@
         <w:pStyle w:val="ListBullet"/>
       </w:pPr>
       <w:r>
-        <w:rPr>
-          <w:b w:val="0"/>
-          <w:i w:val="0"/>
-        </w:rPr>
-        <w:t>Set Capital to 0 unless a later setup rule says otherwise.</w:t>
+        <w:t>Place the selected Leader Card, Financier Reference, and Capital Tracker near your play area.</w:t>
       </w:r>
     </w:p>
     <w:p>
@@ -1165,7 +1135,15 @@
           <w:b w:val="0"/>
           <w:i w:val="0"/>
         </w:rPr>
-        <w:t>Mark every Territory Deed as unowned.</w:t>
+        <w:t>Set Capital to 0 unless a later setup rule says otherwise.</w:t>
+      </w:r>
+    </w:p>
+    <w:p>
+      <w:pPr>
+        <w:pStyle w:val="ListBullet"/>
+      </w:pPr>
+      <w:r>
+        <w:t>Place all eight generic Deed Cards in a shared unowned supply.</w:t>
       </w:r>
     </w:p>
     <w:p>
@@ -1371,6 +1349,12 @@
           <w:i w:val="0"/>
         </w:rPr>
         <w:t>Each Territory has one Deed. A Deed is either unowned or owned by a Financier. Heartlands do not have Deeds.</w:t>
+      </w:r>
+    </w:p>
+    <w:p>
+      <w:pPr/>
+      <w:r>
+        <w:t>Owned Deeds are represented by generic Deed Cards. Unused Deed Cards remain in the shared supply. When you buy an unowned Deed, take one Deed Card from the supply and place it beside that Territory on your side of the Gauntlet.</w:t>
       </w:r>
     </w:p>
     <w:p>
@@ -1730,11 +1714,7 @@
     </w:p>
     <w:p>
       <w:r>
-        <w:rPr>
-          <w:b w:val="0"/>
-          <w:i w:val="0"/>
-        </w:rPr>
-        <w:t>This victory is public and dynamic. A Territory added by Manifest Destiny has a normal Deed and expands the set required for Controlling Interest.</w:t>
+        <w:t>This victory is public and dynamic: every Territory in the Gauntlet must have a Deed Card on your side. A Territory added by Manifest Destiny uses one of the same generic Deed Cards.</w:t>
       </w:r>
     </w:p>
     <w:p>
@@ -3601,11 +3581,7 @@
     </w:p>
     <w:p>
       <w:r>
-        <w:rPr>
-          <w:b w:val="0"/>
-          <w:i w:val="0"/>
-        </w:rPr>
-        <w:t>A normal Deed purchase uses one Action opportunity and resolves one Deed. Pay the full cost, then mark the Deed owned by the buyer. A buyout transfers an opposing Financier's Deed and includes the opposing-owner premium. Effects that permit several purchases resolve each purchase fully before the next cost is calculated.</w:t>
+        <w:t>A normal Deed purchase uses one Action opportunity and resolves one Deed. Pay the full cost, then take one generic Deed Card from the supply and place it beside that Territory on the buyer's side. A buyout moves that Deed Card to the new owner's side and includes the opposing-owner premium. Effects that permit several purchases resolve each purchase fully before the next cost is calculated.</w:t>
       </w:r>
     </w:p>
     <w:p>
@@ -5809,11 +5785,7 @@
         <w:pStyle w:val="ListBullet"/>
       </w:pPr>
       <w:r>
-        <w:rPr>
-          <w:b w:val="0"/>
-          <w:i w:val="0"/>
-        </w:rPr>
-        <w:t>physical tracking burden;</w:t>
+        <w:t>table footprint and handling of eight full-size generic Deed Cards;</w:t>
       </w:r>
     </w:p>
     <w:p>

</xml_diff>